<commit_message>
Keep lesson and garden sheets within about 10–15 minutes.
Cap question counts (fills, meaning prompts, rewrite); drop long full-poem rewrite blocks from daily packs.

Co-authored-by: Cursor <cursoragent@cursor.com>
</commit_message>
<xml_diff>
--- a/printables/garden-answers/U2-garden-answers.docx
+++ b/printables/garden-answers/U2-garden-answers.docx
@@ -14,7 +14,7 @@
           <w:color w:val="F4A261"/>
           <w:sz w:val="20"/>
         </w:rPr>
-        <w:t>语文书桌 · 园地过关测参考答案（做完再看）</w:t>
+        <w:t>语文书桌 · 园地练习答案（约10–15分钟卷 · 做完再看）</w:t>
       </w:r>
     </w:p>
     <w:p>
@@ -365,7 +365,21 @@
           <w:color w:val="E85D04"/>
           <w:sz w:val="24"/>
         </w:rPr>
-        <w:t>四、综合填空</w:t>
+        <w:t>二补充 / 四、改写</w:t>
+      </w:r>
+    </w:p>
+    <w:p>
+      <w:pPr>
+        <w:spacing w:before="0" w:after="80" w:line="288" w:lineRule="auto"/>
+      </w:pPr>
+      <w:r>
+        <w:rPr>
+          <w:rFonts w:ascii="宋体" w:hAnsi="宋体" w:eastAsia="宋体"/>
+          <w:b w:val="0"/>
+          <w:color w:val="1C1917"/>
+          <w:sz w:val="24"/>
+        </w:rPr>
+        <w:t>关键词：孰能无惑；学/问/思/辨/行；人之所 / 人之所不</w:t>
       </w:r>
     </w:p>
     <w:p>
@@ -379,49 +393,7 @@
           <w:color w:val="1C1917"/>
           <w:sz w:val="24"/>
         </w:rPr>
-        <w:t>人非生而知之者；不学不成；不问不知；学/问/思/辨/行；人之所；人之所不</w:t>
-      </w:r>
-    </w:p>
-    <w:p>
-      <w:pPr>
-        <w:spacing w:before="160" w:after="160" w:line="288" w:lineRule="auto"/>
-      </w:pPr>
-      <w:r>
-        <w:rPr>
-          <w:rFonts w:ascii="宋体" w:hAnsi="宋体" w:eastAsia="宋体"/>
-          <w:b/>
-          <w:color w:val="E85D04"/>
-          <w:sz w:val="24"/>
-        </w:rPr>
-        <w:t>五、改写句子（示例）</w:t>
-      </w:r>
-    </w:p>
-    <w:p>
-      <w:pPr>
-        <w:spacing w:before="0" w:after="80" w:line="288" w:lineRule="auto"/>
-      </w:pPr>
-      <w:r>
-        <w:rPr>
-          <w:rFonts w:ascii="宋体" w:hAnsi="宋体" w:eastAsia="宋体"/>
-          <w:b w:val="0"/>
-          <w:color w:val="1C1917"/>
-          <w:sz w:val="24"/>
-        </w:rPr>
-        <w:t>1. 那盏灯晴天的时候亮着，阴天的时候亮着，雨天的时候也亮着。</w:t>
-      </w:r>
-    </w:p>
-    <w:p>
-      <w:pPr>
-        <w:spacing w:before="0" w:after="120" w:line="288" w:lineRule="auto"/>
-      </w:pPr>
-      <w:r>
-        <w:rPr>
-          <w:rFonts w:ascii="宋体" w:hAnsi="宋体" w:eastAsia="宋体"/>
-          <w:b w:val="0"/>
-          <w:color w:val="1C1917"/>
-          <w:sz w:val="24"/>
-        </w:rPr>
-        <w:t>2. 是谁把家里打扫得干干净净呢？当然是妈妈。（句式对即可）</w:t>
+        <w:t>改写：那盏灯晴天的时候亮着，阴天的时候亮着，雨天的时候也亮着。</w:t>
       </w:r>
     </w:p>
     <w:p>

</xml_diff>